<commit_message>
Updated HR Console features
</commit_message>
<xml_diff>
--- a/storage/dms/originals/DOC-1009.docx
+++ b/storage/dms/originals/DOC-1009.docx
@@ -33,10 +33,7 @@
       </w:r>
       <w:proofErr w:type="spellEnd"/>
       <w:r>
-        <w:t xml:space="preserve"> Vault Developer with 2</w:t>
-      </w:r>
-      <w:r>
-        <w:t>+ years of experience in enterprise application development, configuration, customization, and Life Sciences technology solutions.</w:t>
+        <w:t xml:space="preserve"> Vault Developer with 3+ years of experience in enterprise application development, configuration, customization, and Life Sciences technology solutions.</w:t>
       </w:r>
     </w:p>
     <w:p>
@@ -64,7 +61,10 @@
         <w:jc w:val="both"/>
       </w:pPr>
       <w:r>
-        <w:t>Experienced in designing and maintaining configurable objects, fields, record types, workflows, validation rules, and role-based access controls.</w:t>
+        <w:t>Experienced in designing and maintaining configurable objects, fields, record types, workflows, validatio</w:t>
+      </w:r>
+      <w:r>
+        <w:t>n rules, and role-based access controls.</w:t>
       </w:r>
     </w:p>
     <w:p>
@@ -92,7 +92,10 @@
         <w:jc w:val="both"/>
       </w:pPr>
       <w:r>
-        <w:t>Experienced in supporting integrations using REST API concepts and collaborating with cross-functional teams on system enhancements.</w:t>
+        <w:t>Experienced in supporting integrations using REST API concept</w:t>
+      </w:r>
+      <w:r>
+        <w:t>s and collaborating with cross-functional teams on system enhancements.</w:t>
       </w:r>
     </w:p>
     <w:p>
@@ -137,10 +140,6 @@
         </w:tabs>
         <w:spacing w:before="200" w:after="60"/>
         <w:ind w:left="120" w:right="120"/>
-        <w:rPr>
-          <w:b/>
-          <w:bCs/>
-        </w:rPr>
       </w:pPr>
       <w:r>
         <w:rPr>
@@ -157,7 +156,14 @@
           <w:b/>
           <w:bCs/>
         </w:rPr>
-        <w:t>May 2025 – Present</w:t>
+        <w:t>May 2024</w:t>
+      </w:r>
+      <w:r>
+        <w:rPr>
+          <w:b/>
+          <w:bCs/>
+        </w:rPr>
+        <w:t xml:space="preserve"> – Present</w:t>
       </w:r>
     </w:p>
     <w:p>
@@ -223,7 +229,10 @@
         <w:jc w:val="both"/>
       </w:pPr>
       <w:r>
-        <w:t>Configured workflows for submission planning, review, approval, tracking, and region-specific regulatory activities.</w:t>
+        <w:t>Configured workflows for submission planning, review, approval, tracking, and region-specific regulatory act</w:t>
+      </w:r>
+      <w:r>
+        <w:t>ivities.</w:t>
       </w:r>
     </w:p>
     <w:p>
@@ -265,7 +274,10 @@
         <w:jc w:val="both"/>
       </w:pPr>
       <w:r>
-        <w:t>Supported regulatory milestone tracking and Health Authority correspondence processes.</w:t>
+        <w:t>Supported regulatory mile</w:t>
+      </w:r>
+      <w:r>
+        <w:t>stone tracking and Health Authority correspondence processes.</w:t>
       </w:r>
     </w:p>
     <w:p>
@@ -293,7 +305,10 @@
         <w:jc w:val="both"/>
       </w:pPr>
       <w:r>
-        <w:t>Supported Vault Loader activities for regulatory data uploads, field mapping, data cleansing, validation, and reconciliation.</w:t>
+        <w:t>Supported Vault Loader activities for regulatory data uploa</w:t>
+      </w:r>
+      <w:r>
+        <w:t>ds, field mapping, data cleansing, validation, and reconciliation.</w:t>
       </w:r>
     </w:p>
     <w:p>
@@ -370,7 +385,14 @@
           <w:b/>
           <w:bCs/>
         </w:rPr>
-        <w:t>June 2024 – May 2025</w:t>
+        <w:t>June 2023 – May</w:t>
+      </w:r>
+      <w:r>
+        <w:rPr>
+          <w:b/>
+          <w:bCs/>
+        </w:rPr>
+        <w:t xml:space="preserve"> 2024</w:t>
       </w:r>
     </w:p>
     <w:p>
@@ -436,7 +458,10 @@
         <w:jc w:val="both"/>
       </w:pPr>
       <w:r>
-        <w:t>Configured object and document lifecycles with entry criteria, exit criteria, state transitions, automated role assignments, and approval routing.</w:t>
+        <w:t>Configured object and document lifecycles with entry criteria, exit cr</w:t>
+      </w:r>
+      <w:r>
+        <w:t>iteria, state transitions, automated role assignments, and approval routing.</w:t>
       </w:r>
     </w:p>
     <w:p>
@@ -464,7 +489,10 @@
         <w:jc w:val="both"/>
       </w:pPr>
       <w:r>
-        <w:t>Configured document control processes including document types, metadata, versioning, workflows, approvals, archival, and retention.</w:t>
+        <w:t>Configured document control processes includ</w:t>
+      </w:r>
+      <w:r>
+        <w:t>ing document types, metadata, versioning, workflows, approvals, archival, and retention.</w:t>
       </w:r>
     </w:p>
     <w:p>
@@ -492,7 +520,10 @@
         <w:jc w:val="both"/>
       </w:pPr>
       <w:r>
-        <w:t>Supported data migration activities using Vault Loader, including metadata mapping, cleansing, validation, upload, and reconciliation.</w:t>
+        <w:t>Supported data migratio</w:t>
+      </w:r>
+      <w:r>
+        <w:t>n activities using Vault Loader, including metadata mapping, cleansing, validation, upload, and reconciliation.</w:t>
       </w:r>
     </w:p>
     <w:p>
@@ -520,7 +551,10 @@
         <w:jc w:val="both"/>
       </w:pPr>
       <w:r>
-        <w:t>Supported validation and testing activities including test case preparation, execution, defect tracking, UAT, and validation documentation.</w:t>
+        <w:t>Supported v</w:t>
+      </w:r>
+      <w:r>
+        <w:t>alidation and testing activities including test case preparation, execution, defect tracking, UAT, and validation documentation.</w:t>
       </w:r>
     </w:p>
     <w:p>
@@ -548,7 +582,10 @@
         <w:jc w:val="both"/>
       </w:pPr>
       <w:r>
-        <w:t>Collaborated with Quality, QA, and business stakeholders to refine requirements, resolve issues, and improve system processes.</w:t>
+        <w:t>Colla</w:t>
+      </w:r>
+      <w:r>
+        <w:t>borated with Quality, QA, and business stakeholders to refine requirements, resolve issues, and improve system processes.</w:t>
       </w:r>
     </w:p>
     <w:p>
@@ -588,7 +625,10 @@
       </w:r>
       <w:proofErr w:type="spellEnd"/>
       <w:r>
-        <w:t>, RIM, Registrations, Submissions, eCTD, Change Control, CAPA, Deviations, Complaints, Audits, Training</w:t>
+        <w:t>, RIM, Registrations, Submissions, eCTD, Change Control, CAPA, Deviations, Complaints, Au</w:t>
+      </w:r>
+      <w:r>
+        <w:t>dits, Training</w:t>
       </w:r>
     </w:p>
     <w:p>
@@ -657,29 +697,16 @@
         <w:jc w:val="both"/>
       </w:pPr>
       <w:r>
-        <w:rPr>
-          <w:b/>
-          <w:bCs/>
-        </w:rPr>
-        <w:t>B. Tech</w:t>
-      </w:r>
-      <w:r>
-        <w:t xml:space="preserve"> –  Hindustan Institute of Technology and Science, Chennai, India</w:t>
-      </w:r>
-      <w:r>
-        <w:t xml:space="preserve"> |</w:t>
-      </w:r>
-      <w:r>
-        <w:t xml:space="preserve"> 2024</w:t>
-      </w:r>
-    </w:p>
-    <w:p>
-      <w:pPr>
-        <w:pStyle w:val="ListParagraph"/>
-        <w:spacing w:after="60" w:line="264" w:lineRule="auto"/>
-        <w:ind w:left="540"/>
-        <w:jc w:val="both"/>
-      </w:pPr>
+        <w:t xml:space="preserve">Bachelor of Engineering (Computer Science &amp; Engineering), Anna University College of Engineering, </w:t>
+      </w:r>
+      <w:proofErr w:type="spellStart"/>
+      <w:r>
+        <w:t>Ariyalur</w:t>
+      </w:r>
+      <w:proofErr w:type="spellEnd"/>
+      <w:r>
+        <w:t xml:space="preserve"> – 2023</w:t>
+      </w:r>
     </w:p>
     <w:sectPr>
       <w:headerReference w:type="default" r:id="rId7"/>
@@ -736,6 +763,7 @@
     <w:pPr>
       <w:jc w:val="center"/>
     </w:pPr>
+    <w:proofErr w:type="spellStart"/>
     <w:r>
       <w:rPr>
         <w:b/>
@@ -743,7 +771,17 @@
         <w:sz w:val="30"/>
         <w:szCs w:val="30"/>
       </w:rPr>
-      <w:t>Alfred Joe E</w:t>
+      <w:t>Arun</w:t>
+    </w:r>
+    <w:proofErr w:type="spellEnd"/>
+    <w:r>
+      <w:rPr>
+        <w:b/>
+        <w:bCs/>
+        <w:sz w:val="30"/>
+        <w:szCs w:val="30"/>
+      </w:rPr>
+      <w:t xml:space="preserve"> Kumar Raja</w:t>
     </w:r>
   </w:p>
   <w:p>
@@ -772,31 +810,21 @@
       <w:spacing w:after="160"/>
       <w:jc w:val="center"/>
     </w:pPr>
-    <w:hyperlink r:id="rId1" w:history="1">
-      <w:r>
-        <w:rPr>
-          <w:rStyle w:val="Hyperlink"/>
-          <w:color w:val="000000" w:themeColor="text1"/>
-          <w:sz w:val="22"/>
-          <w:szCs w:val="22"/>
-        </w:rPr>
-        <w:t>alfredjoe.e@rudhrainfosolutions.com</w:t>
-      </w:r>
-    </w:hyperlink>
-    <w:r>
-      <w:rPr>
-        <w:color w:val="000000" w:themeColor="text1"/>
-        <w:sz w:val="22"/>
-        <w:szCs w:val="22"/>
-      </w:rPr>
-      <w:t xml:space="preserve"> </w:t>
-    </w:r>
+    <w:proofErr w:type="gramStart"/>
     <w:r>
       <w:rPr>
         <w:sz w:val="22"/>
         <w:szCs w:val="22"/>
       </w:rPr>
-      <w:t>| 7338980910</w:t>
+      <w:t>dualtricks.akr@gmail.com  |</w:t>
+    </w:r>
+    <w:proofErr w:type="gramEnd"/>
+    <w:r>
+      <w:rPr>
+        <w:sz w:val="22"/>
+        <w:szCs w:val="22"/>
+      </w:rPr>
+      <w:t xml:space="preserve">  8778611664</w:t>
     </w:r>
   </w:p>
 </w:hdr>
@@ -805,96 +833,10 @@
 <file path=word/numbering.xml><?xml version="1.0" encoding="utf-8"?>
 <w:numbering xmlns:wpc="http://schemas.microsoft.com/office/word/2010/wordprocessingCanvas" xmlns:cx="http://schemas.microsoft.com/office/drawing/2014/chartex" xmlns:mc="http://schemas.openxmlformats.org/markup-compatibility/2006" xmlns:o="urn:schemas-microsoft-com:office:office" xmlns:r="http://schemas.openxmlformats.org/officeDocument/2006/relationships" xmlns:m="http://schemas.openxmlformats.org/officeDocument/2006/math" xmlns:v="urn:schemas-microsoft-com:vml" xmlns:wp14="http://schemas.microsoft.com/office/word/2010/wordprocessingDrawing" xmlns:wp="http://schemas.openxmlformats.org/drawingml/2006/wordprocessingDrawing" xmlns:w10="urn:schemas-microsoft-com:office:word" xmlns:w="http://schemas.openxmlformats.org/wordprocessingml/2006/main" xmlns:w14="http://schemas.microsoft.com/office/word/2010/wordml" xmlns:w15="http://schemas.microsoft.com/office/word/2012/wordml" xmlns:w16se="http://schemas.microsoft.com/office/word/2015/wordml/symex" xmlns:wpg="http://schemas.microsoft.com/office/word/2010/wordprocessingGroup" xmlns:wpi="http://schemas.microsoft.com/office/word/2010/wordprocessingInk" xmlns:wne="http://schemas.microsoft.com/office/word/2006/wordml" xmlns:wps="http://schemas.microsoft.com/office/word/2010/wordprocessingShape" mc:Ignorable="w14 w15 w16se wp14">
   <w:abstractNum w:abstractNumId="0" w15:restartNumberingAfterBreak="0">
-    <w:nsid w:val="33B9727E"/>
+    <w:nsid w:val="1AB265FD"/>
     <w:multiLevelType w:val="hybridMultilevel"/>
-    <w:tmpl w:val="4C28341E"/>
-    <w:lvl w:ilvl="0" w:tplc="CF4AD1DA">
-      <w:start w:val="1"/>
-      <w:numFmt w:val="bullet"/>
-      <w:lvlText w:val="●"/>
-      <w:lvlJc w:val="left"/>
-      <w:pPr>
-        <w:ind w:left="720" w:hanging="360"/>
-      </w:pPr>
-    </w:lvl>
-    <w:lvl w:ilvl="1" w:tplc="178A6662">
-      <w:start w:val="1"/>
-      <w:numFmt w:val="bullet"/>
-      <w:lvlText w:val="○"/>
-      <w:lvlJc w:val="left"/>
-      <w:pPr>
-        <w:ind w:left="1440" w:hanging="360"/>
-      </w:pPr>
-    </w:lvl>
-    <w:lvl w:ilvl="2" w:tplc="12780534">
-      <w:start w:val="1"/>
-      <w:numFmt w:val="bullet"/>
-      <w:lvlText w:val="■"/>
-      <w:lvlJc w:val="left"/>
-      <w:pPr>
-        <w:ind w:left="2160" w:hanging="360"/>
-      </w:pPr>
-    </w:lvl>
-    <w:lvl w:ilvl="3" w:tplc="01266484">
-      <w:start w:val="1"/>
-      <w:numFmt w:val="bullet"/>
-      <w:lvlText w:val="●"/>
-      <w:lvlJc w:val="left"/>
-      <w:pPr>
-        <w:ind w:left="2880" w:hanging="360"/>
-      </w:pPr>
-    </w:lvl>
-    <w:lvl w:ilvl="4" w:tplc="ABBCBF66">
-      <w:start w:val="1"/>
-      <w:numFmt w:val="bullet"/>
-      <w:lvlText w:val="○"/>
-      <w:lvlJc w:val="left"/>
-      <w:pPr>
-        <w:ind w:left="3600" w:hanging="360"/>
-      </w:pPr>
-    </w:lvl>
-    <w:lvl w:ilvl="5" w:tplc="322E9B3A">
-      <w:start w:val="1"/>
-      <w:numFmt w:val="bullet"/>
-      <w:lvlText w:val="■"/>
-      <w:lvlJc w:val="left"/>
-      <w:pPr>
-        <w:ind w:left="4320" w:hanging="360"/>
-      </w:pPr>
-    </w:lvl>
-    <w:lvl w:ilvl="6" w:tplc="7D0C9472">
-      <w:start w:val="1"/>
-      <w:numFmt w:val="bullet"/>
-      <w:lvlText w:val="●"/>
-      <w:lvlJc w:val="left"/>
-      <w:pPr>
-        <w:ind w:left="5040" w:hanging="360"/>
-      </w:pPr>
-    </w:lvl>
-    <w:lvl w:ilvl="7" w:tplc="4FAC03D4">
-      <w:start w:val="1"/>
-      <w:numFmt w:val="bullet"/>
-      <w:lvlText w:val="●"/>
-      <w:lvlJc w:val="left"/>
-      <w:pPr>
-        <w:ind w:left="5760" w:hanging="360"/>
-      </w:pPr>
-    </w:lvl>
-    <w:lvl w:ilvl="8" w:tplc="5C78D9BC">
-      <w:start w:val="1"/>
-      <w:numFmt w:val="bullet"/>
-      <w:lvlText w:val="●"/>
-      <w:lvlJc w:val="left"/>
-      <w:pPr>
-        <w:ind w:left="6480" w:hanging="360"/>
-      </w:pPr>
-    </w:lvl>
-  </w:abstractNum>
-  <w:abstractNum w:abstractNumId="1" w15:restartNumberingAfterBreak="0">
-    <w:nsid w:val="624415D9"/>
-    <w:multiLevelType w:val="hybridMultilevel"/>
-    <w:tmpl w:val="AF54A364"/>
-    <w:lvl w:ilvl="0" w:tplc="D95081E0">
+    <w:tmpl w:val="CFEC17F4"/>
+    <w:lvl w:ilvl="0" w:tplc="389AEC02">
       <w:start w:val="1"/>
       <w:numFmt w:val="bullet"/>
       <w:lvlText w:val="•"/>
@@ -906,55 +848,141 @@
         <w:rFonts w:ascii="Times New Roman" w:eastAsia="Times New Roman" w:hAnsi="Times New Roman" w:cs="Times New Roman"/>
       </w:rPr>
     </w:lvl>
-    <w:lvl w:ilvl="1" w:tplc="F2CAF120">
+    <w:lvl w:ilvl="1" w:tplc="C038C06E">
       <w:numFmt w:val="decimal"/>
       <w:lvlText w:val=""/>
       <w:lvlJc w:val="left"/>
     </w:lvl>
-    <w:lvl w:ilvl="2" w:tplc="1C3A2F22">
+    <w:lvl w:ilvl="2" w:tplc="C9160E4A">
       <w:numFmt w:val="decimal"/>
       <w:lvlText w:val=""/>
       <w:lvlJc w:val="left"/>
     </w:lvl>
-    <w:lvl w:ilvl="3" w:tplc="752A4232">
+    <w:lvl w:ilvl="3" w:tplc="8FD69B1C">
       <w:numFmt w:val="decimal"/>
       <w:lvlText w:val=""/>
       <w:lvlJc w:val="left"/>
     </w:lvl>
-    <w:lvl w:ilvl="4" w:tplc="03DA119A">
+    <w:lvl w:ilvl="4" w:tplc="0E344C28">
       <w:numFmt w:val="decimal"/>
       <w:lvlText w:val=""/>
       <w:lvlJc w:val="left"/>
     </w:lvl>
-    <w:lvl w:ilvl="5" w:tplc="81C62856">
+    <w:lvl w:ilvl="5" w:tplc="01E29FC0">
       <w:numFmt w:val="decimal"/>
       <w:lvlText w:val=""/>
       <w:lvlJc w:val="left"/>
     </w:lvl>
-    <w:lvl w:ilvl="6" w:tplc="D486B172">
+    <w:lvl w:ilvl="6" w:tplc="0CD0EDE8">
       <w:numFmt w:val="decimal"/>
       <w:lvlText w:val=""/>
       <w:lvlJc w:val="left"/>
     </w:lvl>
-    <w:lvl w:ilvl="7" w:tplc="DD664264">
+    <w:lvl w:ilvl="7" w:tplc="98DE230E">
       <w:numFmt w:val="decimal"/>
       <w:lvlText w:val=""/>
       <w:lvlJc w:val="left"/>
     </w:lvl>
-    <w:lvl w:ilvl="8" w:tplc="7A185F92">
+    <w:lvl w:ilvl="8" w:tplc="3E4086AC">
       <w:numFmt w:val="decimal"/>
       <w:lvlText w:val=""/>
       <w:lvlJc w:val="left"/>
     </w:lvl>
   </w:abstractNum>
+  <w:abstractNum w:abstractNumId="1" w15:restartNumberingAfterBreak="0">
+    <w:nsid w:val="2FDD64DB"/>
+    <w:multiLevelType w:val="hybridMultilevel"/>
+    <w:tmpl w:val="C0ECD8B6"/>
+    <w:lvl w:ilvl="0" w:tplc="6F928F50">
+      <w:start w:val="1"/>
+      <w:numFmt w:val="bullet"/>
+      <w:lvlText w:val="●"/>
+      <w:lvlJc w:val="left"/>
+      <w:pPr>
+        <w:ind w:left="720" w:hanging="360"/>
+      </w:pPr>
+    </w:lvl>
+    <w:lvl w:ilvl="1" w:tplc="9C107BB0">
+      <w:start w:val="1"/>
+      <w:numFmt w:val="bullet"/>
+      <w:lvlText w:val="○"/>
+      <w:lvlJc w:val="left"/>
+      <w:pPr>
+        <w:ind w:left="1440" w:hanging="360"/>
+      </w:pPr>
+    </w:lvl>
+    <w:lvl w:ilvl="2" w:tplc="97B80A20">
+      <w:start w:val="1"/>
+      <w:numFmt w:val="bullet"/>
+      <w:lvlText w:val="■"/>
+      <w:lvlJc w:val="left"/>
+      <w:pPr>
+        <w:ind w:left="2160" w:hanging="360"/>
+      </w:pPr>
+    </w:lvl>
+    <w:lvl w:ilvl="3" w:tplc="C89C8AC0">
+      <w:start w:val="1"/>
+      <w:numFmt w:val="bullet"/>
+      <w:lvlText w:val="●"/>
+      <w:lvlJc w:val="left"/>
+      <w:pPr>
+        <w:ind w:left="2880" w:hanging="360"/>
+      </w:pPr>
+    </w:lvl>
+    <w:lvl w:ilvl="4" w:tplc="4C4090D4">
+      <w:start w:val="1"/>
+      <w:numFmt w:val="bullet"/>
+      <w:lvlText w:val="○"/>
+      <w:lvlJc w:val="left"/>
+      <w:pPr>
+        <w:ind w:left="3600" w:hanging="360"/>
+      </w:pPr>
+    </w:lvl>
+    <w:lvl w:ilvl="5" w:tplc="9134DAA0">
+      <w:start w:val="1"/>
+      <w:numFmt w:val="bullet"/>
+      <w:lvlText w:val="■"/>
+      <w:lvlJc w:val="left"/>
+      <w:pPr>
+        <w:ind w:left="4320" w:hanging="360"/>
+      </w:pPr>
+    </w:lvl>
+    <w:lvl w:ilvl="6" w:tplc="C83C4BA8">
+      <w:start w:val="1"/>
+      <w:numFmt w:val="bullet"/>
+      <w:lvlText w:val="●"/>
+      <w:lvlJc w:val="left"/>
+      <w:pPr>
+        <w:ind w:left="5040" w:hanging="360"/>
+      </w:pPr>
+    </w:lvl>
+    <w:lvl w:ilvl="7" w:tplc="FA92702E">
+      <w:start w:val="1"/>
+      <w:numFmt w:val="bullet"/>
+      <w:lvlText w:val="●"/>
+      <w:lvlJc w:val="left"/>
+      <w:pPr>
+        <w:ind w:left="5760" w:hanging="360"/>
+      </w:pPr>
+    </w:lvl>
+    <w:lvl w:ilvl="8" w:tplc="38C07EE2">
+      <w:start w:val="1"/>
+      <w:numFmt w:val="bullet"/>
+      <w:lvlText w:val="●"/>
+      <w:lvlJc w:val="left"/>
+      <w:pPr>
+        <w:ind w:left="6480" w:hanging="360"/>
+      </w:pPr>
+    </w:lvl>
+  </w:abstractNum>
   <w:num w:numId="1">
-    <w:abstractNumId w:val="0"/>
+    <w:abstractNumId w:val="1"/>
     <w:lvlOverride w:ilvl="0">
       <w:startOverride w:val="1"/>
     </w:lvlOverride>
   </w:num>
   <w:num w:numId="2">
-    <w:abstractNumId w:val="1"/>
+    <w:abstractNumId w:val="0"/>
     <w:lvlOverride w:ilvl="0">
       <w:startOverride w:val="1"/>
     </w:lvlOverride>
@@ -1463,7 +1491,6 @@
   </w:style>
   <w:style w:type="paragraph" w:styleId="ListParagraph">
     <w:name w:val="List Paragraph"/>
-    <w:uiPriority w:val="34"/>
     <w:qFormat/>
   </w:style>
   <w:style w:type="character" w:styleId="Hyperlink">
@@ -1535,59 +1562,6 @@
     <w:rPr>
       <w:sz w:val="20"/>
       <w:szCs w:val="20"/>
-    </w:rPr>
-  </w:style>
-  <w:style w:type="paragraph" w:styleId="Header">
-    <w:name w:val="header"/>
-    <w:basedOn w:val="Normal"/>
-    <w:link w:val="HeaderChar"/>
-    <w:uiPriority w:val="99"/>
-    <w:unhideWhenUsed/>
-    <w:rsid w:val="00041B74"/>
-    <w:pPr>
-      <w:tabs>
-        <w:tab w:val="center" w:pos="4513"/>
-        <w:tab w:val="right" w:pos="9026"/>
-      </w:tabs>
-    </w:pPr>
-  </w:style>
-  <w:style w:type="character" w:customStyle="1" w:styleId="HeaderChar">
-    <w:name w:val="Header Char"/>
-    <w:basedOn w:val="DefaultParagraphFont"/>
-    <w:link w:val="Header"/>
-    <w:uiPriority w:val="99"/>
-    <w:rsid w:val="00041B74"/>
-  </w:style>
-  <w:style w:type="paragraph" w:styleId="Footer">
-    <w:name w:val="footer"/>
-    <w:basedOn w:val="Normal"/>
-    <w:link w:val="FooterChar"/>
-    <w:uiPriority w:val="99"/>
-    <w:unhideWhenUsed/>
-    <w:rsid w:val="00041B74"/>
-    <w:pPr>
-      <w:tabs>
-        <w:tab w:val="center" w:pos="4513"/>
-        <w:tab w:val="right" w:pos="9026"/>
-      </w:tabs>
-    </w:pPr>
-  </w:style>
-  <w:style w:type="character" w:customStyle="1" w:styleId="FooterChar">
-    <w:name w:val="Footer Char"/>
-    <w:basedOn w:val="DefaultParagraphFont"/>
-    <w:link w:val="Footer"/>
-    <w:uiPriority w:val="99"/>
-    <w:rsid w:val="00041B74"/>
-  </w:style>
-  <w:style w:type="character" w:styleId="Strong">
-    <w:name w:val="Strong"/>
-    <w:basedOn w:val="DefaultParagraphFont"/>
-    <w:uiPriority w:val="22"/>
-    <w:qFormat/>
-    <w:rsid w:val="00305FD8"/>
-    <w:rPr>
-      <w:b/>
-      <w:bCs/>
     </w:rPr>
   </w:style>
 </w:styles>

</xml_diff>